<commit_message>
added base projects for Class microservice
</commit_message>
<xml_diff>
--- a/Test Project - Karthineyan N.docx
+++ b/Test Project - Karthineyan N.docx
@@ -206,7 +206,6 @@
         </w:numPr>
       </w:pPr>
       <w:proofErr w:type="spellStart"/>
-      <w:proofErr w:type="gramStart"/>
       <w:r>
         <w:rPr>
           <w:b/>
@@ -215,7 +214,6 @@
         <w:t>ClassService</w:t>
       </w:r>
       <w:proofErr w:type="spellEnd"/>
-      <w:proofErr w:type="gramEnd"/>
       <w:r>
         <w:t>:</w:t>
       </w:r>
@@ -359,6 +357,98 @@
     <w:p>
       <w:pPr>
         <w:numPr>
+          <w:ilvl w:val="1"/>
+          <w:numId w:val="2"/>
+        </w:numPr>
+      </w:pPr>
+      <w:r>
+        <w:rPr>
+          <w:b/>
+          <w:bCs/>
+        </w:rPr>
+        <w:t>**Bonus:</w:t>
+      </w:r>
+      <w:r>
+        <w:rPr>
+          <w:b/>
+          <w:bCs/>
+        </w:rPr>
+        <w:t xml:space="preserve"> </w:t>
+      </w:r>
+      <w:r>
+        <w:t xml:space="preserve">Implement </w:t>
+      </w:r>
+      <w:r>
+        <w:rPr>
+          <w:b/>
+          <w:bCs/>
+        </w:rPr>
+        <w:t>role-based authorization</w:t>
+      </w:r>
+      <w:r>
+        <w:t xml:space="preserve">: </w:t>
+      </w:r>
+    </w:p>
+    <w:p>
+      <w:pPr>
+        <w:numPr>
+          <w:ilvl w:val="2"/>
+          <w:numId w:val="2"/>
+        </w:numPr>
+      </w:pPr>
+      <w:r>
+        <w:t>Instructor can create and update classes.</w:t>
+      </w:r>
+    </w:p>
+    <w:p>
+      <w:pPr>
+        <w:numPr>
+          <w:ilvl w:val="2"/>
+          <w:numId w:val="2"/>
+        </w:numPr>
+      </w:pPr>
+      <w:r>
+        <w:t>Member can only view and book classes.</w:t>
+      </w:r>
+    </w:p>
+    <w:p>
+      <w:pPr>
+        <w:numPr>
+          <w:ilvl w:val="2"/>
+          <w:numId w:val="2"/>
+        </w:numPr>
+      </w:pPr>
+      <w:r>
+        <w:t xml:space="preserve">Add an endpoint to </w:t>
+      </w:r>
+      <w:r>
+        <w:rPr>
+          <w:b/>
+          <w:bCs/>
+        </w:rPr>
+        <w:t>book a class</w:t>
+      </w:r>
+      <w:r>
+        <w:t xml:space="preserve"> (Member only).</w:t>
+      </w:r>
+    </w:p>
+    <w:p>
+      <w:pPr>
+        <w:numPr>
+          <w:ilvl w:val="2"/>
+          <w:numId w:val="2"/>
+        </w:numPr>
+      </w:pPr>
+      <w:r>
+        <w:t>Prevent duplicate bookings for the same class by the same user.</w:t>
+      </w:r>
+    </w:p>
+    <w:p/>
+    <w:p/>
+    <w:p/>
+    <w:p>
+      <w:pPr>
+        <w:numPr>
           <w:ilvl w:val="0"/>
           <w:numId w:val="2"/>
         </w:numPr>
@@ -369,6 +459,7 @@
           <w:b/>
           <w:bCs/>
         </w:rPr>
+        <w:lastRenderedPageBreak/>
         <w:t>AccountService</w:t>
       </w:r>
       <w:proofErr w:type="spellEnd"/>
@@ -408,101 +499,6 @@
       <w:proofErr w:type="spellEnd"/>
       <w:r>
         <w:t>, Role (Member or Instructor)</w:t>
-      </w:r>
-    </w:p>
-    <w:p>
-      <w:pPr>
-        <w:numPr>
-          <w:ilvl w:val="1"/>
-          <w:numId w:val="2"/>
-        </w:numPr>
-      </w:pPr>
-      <w:r>
-        <w:rPr>
-          <w:b/>
-          <w:bCs/>
-        </w:rPr>
-        <w:t>**Bonus:</w:t>
-      </w:r>
-      <w:r>
-        <w:rPr>
-          <w:b/>
-          <w:bCs/>
-        </w:rPr>
-        <w:t xml:space="preserve"> </w:t>
-      </w:r>
-      <w:r>
-        <w:t xml:space="preserve">Implement </w:t>
-      </w:r>
-      <w:r>
-        <w:rPr>
-          <w:b/>
-          <w:bCs/>
-        </w:rPr>
-        <w:t>role-based authorization</w:t>
-      </w:r>
-      <w:r>
-        <w:t xml:space="preserve">: </w:t>
-      </w:r>
-    </w:p>
-    <w:p>
-      <w:pPr>
-        <w:numPr>
-          <w:ilvl w:val="2"/>
-          <w:numId w:val="2"/>
-        </w:numPr>
-      </w:pPr>
-      <w:proofErr w:type="gramStart"/>
-      <w:r>
-        <w:t>Instructor</w:t>
-      </w:r>
-      <w:proofErr w:type="gramEnd"/>
-      <w:r>
-        <w:t xml:space="preserve"> can create and update classes.</w:t>
-      </w:r>
-    </w:p>
-    <w:p>
-      <w:pPr>
-        <w:numPr>
-          <w:ilvl w:val="2"/>
-          <w:numId w:val="2"/>
-        </w:numPr>
-      </w:pPr>
-      <w:r>
-        <w:t>Member can only view and book classes.</w:t>
-      </w:r>
-    </w:p>
-    <w:p>
-      <w:pPr>
-        <w:numPr>
-          <w:ilvl w:val="2"/>
-          <w:numId w:val="2"/>
-        </w:numPr>
-      </w:pPr>
-      <w:r>
-        <w:lastRenderedPageBreak/>
-        <w:t xml:space="preserve">Add an endpoint to </w:t>
-      </w:r>
-      <w:r>
-        <w:rPr>
-          <w:b/>
-          <w:bCs/>
-        </w:rPr>
-        <w:t>book a class</w:t>
-      </w:r>
-      <w:r>
-        <w:t xml:space="preserve"> (Member only).</w:t>
-      </w:r>
-    </w:p>
-    <w:p>
-      <w:pPr>
-        <w:numPr>
-          <w:ilvl w:val="2"/>
-          <w:numId w:val="2"/>
-        </w:numPr>
-      </w:pPr>
-      <w:r>
-        <w:t>Prevent duplicate bookings for the same class by the same user.</w:t>
       </w:r>
     </w:p>
     <w:p>
@@ -850,6 +846,7 @@
     </w:p>
     <w:p>
       <w:r>
+        <w:lastRenderedPageBreak/>
         <w:pict w14:anchorId="3E4030CB">
           <v:rect id="_x0000_i1030" style="width:0;height:1.5pt" o:hralign="center" o:hrstd="t" o:hr="t" fillcolor="#a0a0a0" stroked="f"/>
         </w:pict>
@@ -878,7 +875,6 @@
         </w:numPr>
       </w:pPr>
       <w:r>
-        <w:lastRenderedPageBreak/>
         <w:t>Provide all source code and artifacts so the project can be reviewed independently.</w:t>
       </w:r>
     </w:p>

</xml_diff>